<commit_message>
Rootworks backup: 2026-07-23 17:29:01
</commit_message>
<xml_diff>
--- a/Clients/Piper AI/Shared/Email Sequences/15.7.26 US GC-CMAR - BizDev Opportunity Hunter.docx
+++ b/Clients/Piper AI/Shared/Email Sequences/15.7.26 US GC-CMAR - BizDev Opportunity Hunter.docx
@@ -4,14 +4,6 @@
   <w:body>
     <w:p>
       <w:pPr>
-        <w:pStyle w:val="Title"/>
-      </w:pPr>
-      <w:r>
-        <w:t xml:space="preserve">15.7.26 US GC-CMAR — BizDev Opportunity Hunter</w:t>
-      </w:r>
-    </w:p>
-    <w:p>
-      <w:pPr>
         <w:pStyle w:val="FirstParagraph"/>
       </w:pPr>
       <w:r>
@@ -25,14 +17,13 @@
         <w:t xml:space="preserve"> </w:t>
       </w:r>
       <w:r>
-        <w:t xml:space="preserve">BD and pursuit leaders at US GC and CMAR firms. 717 net-new contacts, Supersoniq pull 2026-07-15. Never mailed at this seat.</w:t>
-      </w:r>
-    </w:p>
-    <w:p>
-      <w:r>
-        <w:pict>
-          <v:rect style="width:0;height:1.5pt" o:hralign="center" o:hrstd="t" o:hr="t"/>
-        </w:pict>
+        <w:t xml:space="preserve">BD and pursuit leaders at US GC and CMAR firms. 717</w:t>
+      </w:r>
+      <w:r>
+        <w:t xml:space="preserve"> </w:t>
+      </w:r>
+      <w:r>
+        <w:t xml:space="preserve">net-new contacts, Supersoniq pull 2026-07-15. Never mailed at this seat.</w:t>
       </w:r>
     </w:p>
     <w:bookmarkStart w:id="9" w:name="email-1"/>
@@ -75,15 +66,57 @@
         <w:pStyle w:val="BodyText"/>
       </w:pPr>
       <w:r>
-        <w:t xml:space="preserve">How many bid sites is someone at {{company_name}} checking by hand each week?</w:t>
-      </w:r>
-    </w:p>
-    <w:p>
-      <w:pPr>
-        <w:pStyle w:val="BodyText"/>
-      </w:pPr>
-      <w:r>
-        <w:t xml:space="preserve">We can help you see the right opportunities without adding headcount. Every portal gets watched, the login-gated ones included, and only the ones worth pursuing come through.</w:t>
+        <w:t xml:space="preserve">How many bid sites is someone at {{company_name}} checking by hand each</w:t>
+      </w:r>
+      <w:r>
+        <w:t xml:space="preserve"> </w:t>
+      </w:r>
+      <w:r>
+        <w:t xml:space="preserve">week?</w:t>
+      </w:r>
+    </w:p>
+    <w:p>
+      <w:pPr>
+        <w:pStyle w:val="BodyText"/>
+      </w:pPr>
+      <w:r>
+        <w:t xml:space="preserve">We can help you see the right opportunities without adding headcount.</w:t>
+      </w:r>
+      <w:r>
+        <w:t xml:space="preserve"> </w:t>
+      </w:r>
+      <w:r>
+        <w:t xml:space="preserve">Every portal gets watched, the login-gated ones included, and</w:t>
+      </w:r>
+      <w:r>
+        <w:t xml:space="preserve"> </w:t>
+      </w:r>
+      <w:commentRangeStart w:id="0"/>
+      <w:commentRangeStart w:id="1"/>
+      <w:commentRangeStart w:id="100"/>
+      <w:r>
+        <w:t xml:space="preserve">only the ones worth pursuing come through.</w:t>
+      </w:r>
+      <w:commentRangeEnd w:id="0"/>
+      <w:r>
+        <w:rPr>
+          <w:rStyle w:val="CommentReference"/>
+        </w:rPr>
+        <w:commentReference w:id="0"/>
+      </w:r>
+      <w:commentRangeEnd w:id="1"/>
+      <w:r>
+        <w:rPr>
+          <w:rStyle w:val="CommentReference"/>
+        </w:rPr>
+        <w:commentReference w:id="1"/>
+      </w:r>
+      <w:commentRangeEnd w:id="100"/>
+      <w:r>
+        <w:rPr>
+          <w:rStyle w:val="CommentReference"/>
+        </w:rPr>
+        <w:commentReference w:id="100"/>
       </w:r>
     </w:p>
     <w:p>
@@ -103,15 +136,8 @@
       </w:r>
     </w:p>
     <w:p>
-      <w:r>
-        <w:pict>
-          <v:rect style="width:0;height:1.5pt" o:hralign="center" o:hrstd="t" o:hr="t"/>
-        </w:pict>
-      </w:r>
-    </w:p>
-    <w:p>
-      <w:pPr>
-        <w:pStyle w:val="FirstParagraph"/>
+      <w:pPr>
+        <w:pStyle w:val="BodyText"/>
       </w:pPr>
       <w:r>
         <w:rPr>
@@ -140,15 +166,27 @@
         <w:pStyle w:val="BodyText"/>
       </w:pPr>
       <w:r>
-        <w:t xml:space="preserve">How many bid sites is someone at {{company_name}} checking by hand each week?</w:t>
-      </w:r>
-    </w:p>
-    <w:p>
-      <w:pPr>
-        <w:pStyle w:val="BodyText"/>
-      </w:pPr>
-      <w:r>
-        <w:t xml:space="preserve">We can help you see the right opportunities without adding headcount. Every portal gets watched, the login-gated ones included, and only the ones worth pursuing come through.</w:t>
+        <w:t xml:space="preserve">How many bid sites is someone at {{company_name}} checking by hand each</w:t>
+      </w:r>
+      <w:r>
+        <w:t xml:space="preserve"> </w:t>
+      </w:r>
+      <w:r>
+        <w:t xml:space="preserve">week?</w:t>
+      </w:r>
+    </w:p>
+    <w:p>
+      <w:pPr>
+        <w:pStyle w:val="BodyText"/>
+      </w:pPr>
+      <w:r>
+        <w:t xml:space="preserve">We can help you see the right opportunities without adding headcount.</w:t>
+      </w:r>
+      <w:r>
+        <w:t xml:space="preserve"> </w:t>
+      </w:r>
+      <w:r>
+        <w:t xml:space="preserve">Every portal gets watched, the login-gated ones included, and only the ones worth pursuing come through.</w:t>
       </w:r>
     </w:p>
     <w:p>
@@ -168,15 +206,8 @@
       </w:r>
     </w:p>
     <w:p>
-      <w:r>
-        <w:pict>
-          <v:rect style="width:0;height:1.5pt" o:hralign="center" o:hrstd="t" o:hr="t"/>
-        </w:pict>
-      </w:r>
-    </w:p>
-    <w:p>
-      <w:pPr>
-        <w:pStyle w:val="FirstParagraph"/>
+      <w:pPr>
+        <w:pStyle w:val="BodyText"/>
       </w:pPr>
       <w:r>
         <w:rPr>
@@ -213,35 +244,74 @@
         <w:pStyle w:val="BodyText"/>
       </w:pPr>
       <w:r>
-        <w:t xml:space="preserve">We can help you stop finding the right ones late. The watching runs on its own, and only the ones worth pursuing reach you.</w:t>
-      </w:r>
-    </w:p>
-    <w:p>
-      <w:pPr>
-        <w:pStyle w:val="BodyText"/>
-      </w:pPr>
+        <w:t xml:space="preserve">We can help you stop finding the right ones late. The watching runs on</w:t>
+      </w:r>
+      <w:r>
+        <w:t xml:space="preserve"> </w:t>
+      </w:r>
+      <w:r>
+        <w:t xml:space="preserve">its own, and only the ones worth pursuing reach you.</w:t>
+      </w:r>
+    </w:p>
+    <w:p>
+      <w:pPr>
+        <w:pStyle w:val="BodyText"/>
+      </w:pPr>
+      <w:commentRangeStart w:id="2"/>
+      <w:commentRangeStart w:id="3"/>
+      <w:commentRangeStart w:id="101"/>
       <w:r>
         <w:t xml:space="preserve">One BD team was spending 50 hours a month hunting across 40-50 portals by hand.</w:t>
       </w:r>
-    </w:p>
-    <w:p>
-      <w:pPr>
-        <w:pStyle w:val="BodyText"/>
-      </w:pPr>
-      <w:r>
-        <w:t xml:space="preserve">Worth a quick look?</w:t>
-      </w:r>
-    </w:p>
-    <w:p>
-      <w:r>
-        <w:pict>
-          <v:rect style="width:0;height:1.5pt" o:hralign="center" o:hrstd="t" o:hr="t"/>
-        </w:pict>
-      </w:r>
-    </w:p>
-    <w:p>
-      <w:pPr>
-        <w:pStyle w:val="FirstParagraph"/>
+      <w:commentRangeEnd w:id="2"/>
+      <w:r>
+        <w:rPr>
+          <w:rStyle w:val="CommentReference"/>
+        </w:rPr>
+        <w:commentReference w:id="2"/>
+      </w:r>
+      <w:commentRangeEnd w:id="3"/>
+      <w:r>
+        <w:rPr>
+          <w:rStyle w:val="CommentReference"/>
+        </w:rPr>
+        <w:commentReference w:id="3"/>
+      </w:r>
+      <w:commentRangeEnd w:id="101"/>
+      <w:r>
+        <w:rPr>
+          <w:rStyle w:val="CommentReference"/>
+        </w:rPr>
+        <w:commentReference w:id="101"/>
+      </w:r>
+    </w:p>
+    <w:p>
+      <w:pPr>
+        <w:pStyle w:val="BodyText"/>
+      </w:pPr>
+      <w:commentRangeStart w:id="4"/>
+      <w:commentRangeStart w:id="102"/>
+      <w:r>
+        <w:t xml:space="preserve">Want me to send over a quick breakdown?</w:t>
+      </w:r>
+      <w:commentRangeEnd w:id="4"/>
+      <w:r>
+        <w:rPr>
+          <w:rStyle w:val="CommentReference"/>
+        </w:rPr>
+        <w:commentReference w:id="4"/>
+      </w:r>
+      <w:commentRangeEnd w:id="102"/>
+      <w:r>
+        <w:rPr>
+          <w:rStyle w:val="CommentReference"/>
+        </w:rPr>
+        <w:commentReference w:id="102"/>
+      </w:r>
+    </w:p>
+    <w:p>
+      <w:pPr>
+        <w:pStyle w:val="BodyText"/>
       </w:pPr>
       <w:r>
         <w:rPr>
@@ -278,13 +348,21 @@
         <w:pStyle w:val="BodyText"/>
       </w:pPr>
       <w:r>
-        <w:t xml:space="preserve">We can help you stop finding the right ones late. The watching runs on its own, and only the ones worth pursuing reach you.</w:t>
-      </w:r>
-    </w:p>
-    <w:p>
-      <w:pPr>
-        <w:pStyle w:val="BodyText"/>
-      </w:pPr>
+        <w:t xml:space="preserve">We can help you stop finding the right ones late. The watching runs</w:t>
+      </w:r>
+      <w:r>
+        <w:t xml:space="preserve"> </w:t>
+      </w:r>
+      <w:r>
+        <w:t xml:space="preserve">on its own, and only the ones worth pursuing reach you.</w:t>
+      </w:r>
+    </w:p>
+    <w:p>
+      <w:pPr>
+        <w:pStyle w:val="BodyText"/>
+      </w:pPr>
+      <w:commentRangeStart w:id="5"/>
+      <w:commentRangeStart w:id="103"/>
       <w:r>
         <w:t xml:space="preserve">One BD team was spending 50 hours a month hunting across 40-50 portals by hand.</w:t>
       </w:r>
@@ -294,14 +372,21 @@
         <w:pStyle w:val="BodyText"/>
       </w:pPr>
       <w:r>
-        <w:t xml:space="preserve">Worth a quick look?</w:t>
-      </w:r>
-    </w:p>
-    <w:p>
-      <w:r>
-        <w:pict>
-          <v:rect style="width:0;height:1.5pt" o:hralign="center" o:hrstd="t" o:hr="t"/>
-        </w:pict>
+        <w:t xml:space="preserve">Want me to send over a quick breakdown?</w:t>
+      </w:r>
+      <w:commentRangeEnd w:id="5"/>
+      <w:r>
+        <w:rPr>
+          <w:rStyle w:val="CommentReference"/>
+        </w:rPr>
+        <w:commentReference w:id="5"/>
+      </w:r>
+      <w:commentRangeEnd w:id="103"/>
+      <w:r>
+        <w:rPr>
+          <w:rStyle w:val="CommentReference"/>
+        </w:rPr>
+        <w:commentReference w:id="103"/>
       </w:r>
     </w:p>
     <w:bookmarkEnd w:id="9"/>
@@ -330,9 +415,33 @@
       <w:pPr>
         <w:pStyle w:val="BodyText"/>
       </w:pPr>
+      <w:commentRangeStart w:id="6"/>
+      <w:commentRangeStart w:id="7"/>
+      <w:commentRangeStart w:id="104"/>
       <w:r>
         <w:t xml:space="preserve">Most teams don’t lose the bids they chased. They lose the ones they found too late to pursue properly.</w:t>
       </w:r>
+      <w:commentRangeEnd w:id="6"/>
+      <w:r>
+        <w:rPr>
+          <w:rStyle w:val="CommentReference"/>
+        </w:rPr>
+        <w:commentReference w:id="6"/>
+      </w:r>
+      <w:commentRangeEnd w:id="7"/>
+      <w:r>
+        <w:rPr>
+          <w:rStyle w:val="CommentReference"/>
+        </w:rPr>
+        <w:commentReference w:id="7"/>
+      </w:r>
+      <w:commentRangeEnd w:id="104"/>
+      <w:r>
+        <w:rPr>
+          <w:rStyle w:val="CommentReference"/>
+        </w:rPr>
+        <w:commentReference w:id="104"/>
+      </w:r>
     </w:p>
     <w:p>
       <w:pPr>
@@ -351,15 +460,8 @@
       </w:r>
     </w:p>
     <w:p>
-      <w:r>
-        <w:pict>
-          <v:rect style="width:0;height:1.5pt" o:hralign="center" o:hrstd="t" o:hr="t"/>
-        </w:pict>
-      </w:r>
-    </w:p>
-    <w:p>
-      <w:pPr>
-        <w:pStyle w:val="FirstParagraph"/>
+      <w:pPr>
+        <w:pStyle w:val="BodyText"/>
       </w:pPr>
       <w:r>
         <w:rPr>
@@ -374,7 +476,13 @@
         <w:pStyle w:val="BodyText"/>
       </w:pPr>
       <w:r>
-        <w:t xml:space="preserve">Is bid volume capped by how long it takes to find the work, or by what the team can actually build?</w:t>
+        <w:t xml:space="preserve">Is bid volume capped by how long it takes to find the work, or by what</w:t>
+      </w:r>
+      <w:r>
+        <w:t xml:space="preserve"> </w:t>
+      </w:r>
+      <w:r>
+        <w:t xml:space="preserve">the team can actually build?</w:t>
       </w:r>
     </w:p>
     <w:p>
@@ -404,7 +512,525 @@
 </file>
 
 <file path=word/comments.xml><?xml version="1.0" encoding="utf-8"?>
-<w:comments xmlns:w="http://schemas.openxmlformats.org/wordprocessingml/2006/main" xmlns:m="http://schemas.openxmlformats.org/officeDocument/2006/math" xmlns:r="http://schemas.openxmlformats.org/officeDocument/2006/relationships" xmlns:o="urn:schemas-microsoft-com:office:office" xmlns:v="urn:schemas-microsoft-com:vml" xmlns:w10="urn:schemas-microsoft-com:office:word" xmlns:a="http://schemas.openxmlformats.org/drawingml/2006/main" xmlns:pic="http://schemas.openxmlformats.org/drawingml/2006/picture" xmlns:wp="http://schemas.openxmlformats.org/drawingml/2006/wordprocessingDrawing"/>
+<w:comments xmlns:w="http://schemas.openxmlformats.org/wordprocessingml/2006/main" xmlns:m="http://schemas.openxmlformats.org/officeDocument/2006/math" xmlns:r="http://schemas.openxmlformats.org/officeDocument/2006/relationships" xmlns:o="urn:schemas-microsoft-com:office:office" xmlns:v="urn:schemas-microsoft-com:vml" xmlns:w10="urn:schemas-microsoft-com:office:word" xmlns:a="http://schemas.openxmlformats.org/drawingml/2006/main" xmlns:pic="http://schemas.openxmlformats.org/drawingml/2006/picture" xmlns:wp="http://schemas.openxmlformats.org/drawingml/2006/wordprocessingDrawing">
+  <w:comment w:id="0" w:author="Nikol Roitman" w:date="2026-07-20T05:04:53Z">
+    <w:p>
+      <w:pPr>
+        <w:pStyle w:val="CommentText"/>
+      </w:pPr>
+      <w:r>
+        <w:rPr>
+          <w:rStyle w:val="CommentReference"/>
+        </w:rPr>
+        <w:annotationRef/>
+      </w:r>
+      <w:r>
+        <w:rPr>
+          <w:rtl/>
+        </w:rPr>
+        <w:t xml:space="preserve">לא בטוחה</w:t>
+      </w:r>
+      <w:r>
+        <w:rPr>
+          <w:rtl/>
+        </w:rPr>
+        <w:t xml:space="preserve"> </w:t>
+      </w:r>
+      <w:r>
+        <w:rPr>
+          <w:rtl/>
+        </w:rPr>
+        <w:t xml:space="preserve">לגבי השורה הזו. האם התכוונת שהם רואים רק פרויקטים שדומים למה שהם זכו בו</w:t>
+      </w:r>
+      <w:r>
+        <w:rPr>
+          <w:rtl/>
+        </w:rPr>
+        <w:t xml:space="preserve"> </w:t>
+      </w:r>
+      <w:r>
+        <w:rPr>
+          <w:rtl/>
+        </w:rPr>
+        <w:t xml:space="preserve">כבר בעבר</w:t>
+      </w:r>
+      <w:r>
+        <w:t xml:space="preserve">?</w:t>
+      </w:r>
+      <w:r>
+        <w:br/>
+      </w:r>
+      <w:r>
+        <w:rPr>
+          <w:rtl/>
+        </w:rPr>
+        <w:t xml:space="preserve">זה לא ממש מדויק, אבל גם אם זה היה עובד ככה, לא בטוחה שזה מינוי נכון.</w:t>
+      </w:r>
+      <w:r>
+        <w:rPr>
+          <w:rtl/>
+        </w:rPr>
+        <w:t xml:space="preserve"> </w:t>
+      </w:r>
+      <w:r>
+        <w:rPr>
+          <w:rtl/>
+        </w:rPr>
+        <w:t xml:space="preserve">במיוחד לאלו שרוצים להתרחב לפרויקטים ואזורים חדשים. הייתי מורידה או משנה</w:t>
+      </w:r>
+      <w:r>
+        <w:rPr>
+          <w:rtl/>
+        </w:rPr>
+        <w:t xml:space="preserve"> </w:t>
+      </w:r>
+      <w:r>
+        <w:rPr>
+          <w:rtl/>
+        </w:rPr>
+        <w:t xml:space="preserve">את המשפט הזה</w:t>
+      </w:r>
+    </w:p>
+  </w:comment>
+  <w:comment w:id="1" w:author="Shahar Mizrahi" w:date="2026-07-20T08:13:29Z">
+    <w:p>
+      <w:pPr>
+        <w:pStyle w:val="CommentText"/>
+      </w:pPr>
+      <w:r>
+        <w:rPr>
+          <w:rStyle w:val="CommentReference"/>
+        </w:rPr>
+        <w:annotationRef/>
+      </w:r>
+      <w:r>
+        <w:rPr>
+          <w:rtl/>
+        </w:rPr>
+        <w:t xml:space="preserve">גם אם זה לא הכי מדויק עובדתית זה בסדר לא</w:t>
+      </w:r>
+      <w:r>
+        <w:rPr>
+          <w:rtl/>
+        </w:rPr>
+        <w:t xml:space="preserve"> </w:t>
+      </w:r>
+      <w:r>
+        <w:rPr>
+          <w:rtl/>
+        </w:rPr>
+        <w:t xml:space="preserve">חייב להיות 100 אחוז מדויקים. אבל אם זה לא הכי רלוונטי ונשמע ככה אז מקבל,</w:t>
+      </w:r>
+      <w:r>
+        <w:rPr>
+          <w:rtl/>
+        </w:rPr>
+        <w:t xml:space="preserve"> </w:t>
+      </w:r>
+      <w:r>
+        <w:rPr>
+          <w:rtl/>
+        </w:rPr>
+        <w:t xml:space="preserve">אשנה</w:t>
+      </w:r>
+    </w:p>
+  </w:comment>
+  <w:comment w:id="100" w:author="Flowroots - Revision">
+    <w:p>
+      <w:pPr>
+        <w:pStyle w:val="CommentText"/>
+      </w:pPr>
+      <w:r>
+        <w:rPr>
+          <w:rStyle w:val="CommentReference"/>
+        </w:rPr>
+        <w:annotationRef/>
+      </w:r>
+      <w:r>
+        <w:t xml:space="preserve">APPLIED 20.7: rewritten to</w:t>
+      </w:r>
+      <w:r>
+        <w:t xml:space="preserve"> </w:t>
+      </w:r>
+      <w:r>
+        <w:t xml:space="preserve">“only the ones worth pursuing come through”</w:t>
+      </w:r>
+      <w:r>
+        <w:t xml:space="preserve"> </w:t>
+      </w:r>
+      <w:r>
+        <w:t xml:space="preserve">- live in the campaign.</w:t>
+      </w:r>
+    </w:p>
+  </w:comment>
+  <w:comment w:id="2" w:author="Nikol Roitman" w:date="2026-07-20T05:08:56Z">
+    <w:p>
+      <w:pPr>
+        <w:pStyle w:val="CommentText"/>
+      </w:pPr>
+      <w:r>
+        <w:rPr>
+          <w:rStyle w:val="CommentReference"/>
+        </w:rPr>
+        <w:annotationRef/>
+      </w:r>
+      <w:r>
+        <w:rPr>
+          <w:rtl/>
+        </w:rPr>
+        <w:t xml:space="preserve">פה המשפט של ה"אמון" של "צוותים אחרים כבר עושים ככה וככה" לא קשור</w:t>
+      </w:r>
+      <w:r>
+        <w:rPr>
+          <w:rtl/>
+        </w:rPr>
+        <w:t xml:space="preserve"> </w:t>
+      </w:r>
+      <w:r>
+        <w:rPr>
+          <w:rtl/>
+        </w:rPr>
+        <w:t xml:space="preserve">לשאר המייל. אתה כותב במייל שאנחנו עוזרים למצוא הזדמנויות חדשות, ואז</w:t>
+      </w:r>
+      <w:r>
+        <w:rPr>
+          <w:rtl/>
+        </w:rPr>
+        <w:t xml:space="preserve"> </w:t>
+      </w:r>
+      <w:r>
+        <w:rPr>
+          <w:rtl/>
+        </w:rPr>
+        <w:t xml:space="preserve">במשפט הסוגר מתאר בכלל ערך אחר, שהם מקבלים סיכום של המכרז. לדעתי צריך</w:t>
+      </w:r>
+      <w:r>
+        <w:rPr>
+          <w:rtl/>
+        </w:rPr>
+        <w:t xml:space="preserve"> </w:t>
+      </w:r>
+      <w:r>
+        <w:rPr>
+          <w:rtl/>
+        </w:rPr>
+        <w:t xml:space="preserve">שהמשפט האחרון יסכם את הערך שדיברנו עליו בתחילת המייל, אבל אשמח לשמוע אם</w:t>
+      </w:r>
+      <w:r>
+        <w:rPr>
+          <w:rtl/>
+        </w:rPr>
+        <w:t xml:space="preserve"> </w:t>
+      </w:r>
+      <w:r>
+        <w:rPr>
+          <w:rtl/>
+        </w:rPr>
+        <w:t xml:space="preserve">היתה סיבה ספציפית ללמה בנית את זה אופן הנל</w:t>
+      </w:r>
+      <w:r>
+        <w:t xml:space="preserve"> </w:t>
+      </w:r>
+      <w:r>
+        <w:t xml:space="preserve">:)</w:t>
+      </w:r>
+    </w:p>
+  </w:comment>
+  <w:comment w:id="3" w:author="Shahar Mizrahi" w:date="2026-07-20T08:15:27Z">
+    <w:p>
+      <w:pPr>
+        <w:pStyle w:val="CommentText"/>
+      </w:pPr>
+      <w:r>
+        <w:rPr>
+          <w:rStyle w:val="CommentReference"/>
+        </w:rPr>
+        <w:annotationRef/>
+      </w:r>
+      <w:r>
+        <w:rPr>
+          <w:rtl/>
+        </w:rPr>
+        <w:t xml:space="preserve">סיכום מכרז לא קשור ישירות למציאת הזדמנויות</w:t>
+      </w:r>
+      <w:r>
+        <w:rPr>
+          <w:rtl/>
+        </w:rPr>
+        <w:t xml:space="preserve"> </w:t>
+      </w:r>
+      <w:r>
+        <w:rPr>
+          <w:rtl/>
+        </w:rPr>
+        <w:t xml:space="preserve">חדשות? ז״א חלק מהעבודה זה לא לגלות את ההזדמנות דרך עיון</w:t>
+      </w:r>
+      <w:r>
+        <w:rPr>
+          <w:rtl/>
+        </w:rPr>
+        <w:t xml:space="preserve"> </w:t>
+      </w:r>
+      <w:r>
+        <w:rPr>
+          <w:rtl/>
+        </w:rPr>
+        <w:t xml:space="preserve">במכרז</w:t>
+      </w:r>
+      <w:r>
+        <w:t xml:space="preserve">?</w:t>
+      </w:r>
+    </w:p>
+  </w:comment>
+  <w:comment w:id="101" w:author="Flowroots - Revision">
+    <w:p>
+      <w:pPr>
+        <w:pStyle w:val="CommentText"/>
+      </w:pPr>
+      <w:r>
+        <w:rPr>
+          <w:rStyle w:val="CommentReference"/>
+        </w:rPr>
+        <w:annotationRef/>
+      </w:r>
+      <w:r>
+        <w:t xml:space="preserve">APPLIED 20.7: proof swapped to match the email’s finding-value - now</w:t>
+      </w:r>
+      <w:r>
+        <w:t xml:space="preserve"> </w:t>
+      </w:r>
+      <w:r>
+        <w:t xml:space="preserve">“One BD team was spending 50 hours a month hunting across 40-50 portals by hand.”</w:t>
+      </w:r>
+      <w:r>
+        <w:t xml:space="preserve"> </w:t>
+      </w:r>
+      <w:r>
+        <w:t xml:space="preserve">The filter line was also rewritten to</w:t>
+      </w:r>
+      <w:r>
+        <w:t xml:space="preserve"> </w:t>
+      </w:r>
+      <w:r>
+        <w:t xml:space="preserve">“only the ones worth pursuing reach you”</w:t>
+      </w:r>
+      <w:r>
+        <w:t xml:space="preserve">.</w:t>
+      </w:r>
+    </w:p>
+  </w:comment>
+  <w:comment w:id="4" w:author="Nikol Roitman" w:date="2026-07-20T05:09:53Z">
+    <w:p>
+      <w:pPr>
+        <w:pStyle w:val="CommentText"/>
+      </w:pPr>
+      <w:r>
+        <w:rPr>
+          <w:rStyle w:val="CommentReference"/>
+        </w:rPr>
+        <w:annotationRef/>
+      </w:r>
+      <w:r>
+        <w:rPr>
+          <w:rtl/>
+        </w:rPr>
+        <w:t xml:space="preserve">גם הייתי מחזרת את הקריאה לפעולה</w:t>
+      </w:r>
+    </w:p>
+  </w:comment>
+  <w:comment w:id="102" w:author="Flowroots - Revision">
+    <w:p>
+      <w:pPr>
+        <w:pStyle w:val="CommentText"/>
+      </w:pPr>
+      <w:r>
+        <w:rPr>
+          <w:rStyle w:val="CommentReference"/>
+        </w:rPr>
+        <w:annotationRef/>
+      </w:r>
+      <w:r>
+        <w:t xml:space="preserve">APPLIED: first strengthened to</w:t>
+      </w:r>
+      <w:r>
+        <w:t xml:space="preserve"> </w:t>
+      </w:r>
+      <w:r>
+        <w:t xml:space="preserve">“Worth a quick look?”</w:t>
+      </w:r>
+      <w:r>
+        <w:t xml:space="preserve"> </w:t>
+      </w:r>
+      <w:r>
+        <w:t xml:space="preserve">(20.7), now to a concrete ask we deliver in a reply (23.7).</w:t>
+      </w:r>
+    </w:p>
+  </w:comment>
+  <w:comment w:id="5" w:author="Nikol Roitman" w:date="2026-07-20T05:11:09Z">
+    <w:p>
+      <w:pPr>
+        <w:pStyle w:val="CommentText"/>
+      </w:pPr>
+      <w:r>
+        <w:rPr>
+          <w:rStyle w:val="CommentReference"/>
+        </w:rPr>
+        <w:annotationRef/>
+      </w:r>
+      <w:r>
+        <w:rPr>
+          <w:rtl/>
+        </w:rPr>
+        <w:t xml:space="preserve">כנל כמו במייל הקודם</w:t>
+      </w:r>
+    </w:p>
+  </w:comment>
+  <w:comment w:id="103" w:author="Flowroots - Revision">
+    <w:p>
+      <w:pPr>
+        <w:pStyle w:val="CommentText"/>
+      </w:pPr>
+      <w:r>
+        <w:rPr>
+          <w:rStyle w:val="CommentReference"/>
+        </w:rPr>
+        <w:annotationRef/>
+      </w:r>
+      <w:r>
+        <w:t xml:space="preserve">Same fixes as 1C applied here: the hunting proof and the CTA.</w:t>
+      </w:r>
+    </w:p>
+  </w:comment>
+  <w:comment w:id="6" w:author="Nikol Roitman" w:date="2026-07-20T05:16:00Z">
+    <w:p>
+      <w:pPr>
+        <w:pStyle w:val="CommentText"/>
+      </w:pPr>
+      <w:r>
+        <w:rPr>
+          <w:rStyle w:val="CommentReference"/>
+        </w:rPr>
+        <w:annotationRef/>
+      </w:r>
+      <w:r>
+        <w:rPr>
+          <w:rtl/>
+        </w:rPr>
+        <w:t xml:space="preserve">אני לא בטוחה שזה משפט מדויק שהם יזדהו איתו, כי זה לא לחמניות שנחטפו</w:t>
+      </w:r>
+      <w:r>
+        <w:rPr>
+          <w:rtl/>
+        </w:rPr>
+        <w:t xml:space="preserve"> </w:t>
+      </w:r>
+      <w:r>
+        <w:rPr>
+          <w:rtl/>
+        </w:rPr>
+        <w:t xml:space="preserve">כשאף אחד לא ראה והקודם זכה. מכרזים מפורסמים ויש להם דד ליינים מסודרים.</w:t>
+      </w:r>
+      <w:r>
+        <w:rPr>
+          <w:rtl/>
+        </w:rPr>
+        <w:t xml:space="preserve"> </w:t>
+      </w:r>
+      <w:r>
+        <w:rPr>
+          <w:rtl/>
+        </w:rPr>
+        <w:t xml:space="preserve">אז מה שכן הייתי כותבת שיתאים פה ולדעתי יהיה מדויק יותר הוא</w:t>
+      </w:r>
+      <w:r>
+        <w:t xml:space="preserve"> </w:t>
+      </w:r>
+      <w:r>
+        <w:t xml:space="preserve">"Most teams problem is'nt losing the bids they chased. It that they’re</w:t>
+      </w:r>
+      <w:r>
+        <w:t xml:space="preserve"> </w:t>
+      </w:r>
+      <w:r>
+        <w:t xml:space="preserve">losing the ones that they didn't see published before it was too</w:t>
+      </w:r>
+      <w:r>
+        <w:t xml:space="preserve"> </w:t>
+      </w:r>
+      <w:r>
+        <w:t xml:space="preserve">late."</w:t>
+      </w:r>
+      <w:r>
+        <w:br/>
+      </w:r>
+      <w:r>
+        <w:rPr>
+          <w:rtl/>
+        </w:rPr>
+        <w:t xml:space="preserve">משהו כזה רק בתחביר נורמלי</w:t>
+      </w:r>
+    </w:p>
+  </w:comment>
+  <w:comment w:id="7" w:author="Shahar Mizrahi" w:date="2026-07-20T08:16:05Z">
+    <w:p>
+      <w:pPr>
+        <w:pStyle w:val="CommentText"/>
+      </w:pPr>
+      <w:r>
+        <w:rPr>
+          <w:rStyle w:val="CommentReference"/>
+        </w:rPr>
+        <w:annotationRef/>
+      </w:r>
+      <w:r>
+        <w:rPr>
+          <w:rtl/>
+        </w:rPr>
+        <w:t xml:space="preserve">אוקיי מדהים מעולה</w:t>
+      </w:r>
+      <w:r>
+        <w:rPr>
+          <w:rtl/>
+        </w:rPr>
+        <w:t xml:space="preserve"> </w:t>
+      </w:r>
+      <w:r>
+        <w:rPr>
+          <w:rtl/>
+        </w:rPr>
+        <w:t xml:space="preserve">אשנה</w:t>
+      </w:r>
+    </w:p>
+  </w:comment>
+  <w:comment w:id="104" w:author="Flowroots - Revision">
+    <w:p>
+      <w:pPr>
+        <w:pStyle w:val="CommentText"/>
+      </w:pPr>
+      <w:r>
+        <w:rPr>
+          <w:rStyle w:val="CommentReference"/>
+        </w:rPr>
+        <w:annotationRef/>
+      </w:r>
+      <w:r>
+        <w:t xml:space="preserve">APPLIED 20.7: rewritten per Nikol -</w:t>
+      </w:r>
+      <w:r>
+        <w:t xml:space="preserve"> </w:t>
+      </w:r>
+      <w:r>
+        <w:t xml:space="preserve">“Most teams don’t lose the bids they chased. They lose the ones they found too late to pursue properly.”</w:t>
+      </w:r>
+      <w:r>
+        <w:t xml:space="preserve"> </w:t>
+      </w:r>
+      <w:r>
+        <w:t xml:space="preserve">- live.</w:t>
+      </w:r>
+    </w:p>
+  </w:comment>
+</w:comments>
 </file>
 
 <file path=word/footnotes.xml><?xml version="1.0" encoding="utf-8"?>

</xml_diff>